<commit_message>
Deleted build_release and debug dir
</commit_message>
<xml_diff>
--- a/Exercises/exercise_05/Considerazioni finali.docx
+++ b/Exercises/exercise_05/Considerazioni finali.docx
@@ -1,6 +1,6 @@
 
 <file path=word/document.xml><?xml version="1.0" encoding="utf-8"?>
-<w:document xmlns:wpc="http://schemas.microsoft.com/office/word/2010/wordprocessingCanvas" xmlns:cx="http://schemas.microsoft.com/office/drawing/2014/chartex" xmlns:cx1="http://schemas.microsoft.com/office/drawing/2015/9/8/chartex" xmlns:cx2="http://schemas.microsoft.com/office/drawing/2015/10/21/chartex" xmlns:cx3="http://schemas.microsoft.com/office/drawing/2016/5/9/chartex" xmlns:cx4="http://schemas.microsoft.com/office/drawing/2016/5/10/chartex" xmlns:cx5="http://schemas.microsoft.com/office/drawing/2016/5/11/chartex" xmlns:cx6="http://schemas.microsoft.com/office/drawing/2016/5/12/chartex" xmlns:cx7="http://schemas.microsoft.com/office/drawing/2016/5/13/chartex" xmlns:cx8="http://schemas.microsoft.com/office/drawing/2016/5/14/chartex" xmlns:mc="http://schemas.openxmlformats.org/markup-compatibility/2006" xmlns:aink="http://schemas.microsoft.com/office/drawing/2016/ink" xmlns:am3d="http://schemas.microsoft.com/office/drawing/2017/model3d" xmlns:o="urn:schemas-microsoft-com:office:office" xmlns:oel="http://schemas.microsoft.com/office/2019/extlst" xmlns:r="http://schemas.openxmlformats.org/officeDocument/2006/relationships" xmlns:m="http://schemas.openxmlformats.org/officeDocument/2006/math" xmlns:v="urn:schemas-microsoft-com:vml" xmlns:wp14="http://schemas.microsoft.com/office/word/2010/wordprocessingDrawing" xmlns:wp="http://schemas.openxmlformats.org/drawingml/2006/wordprocessingDrawing" xmlns:w10="urn:schemas-microsoft-com:office:word" xmlns:w="http://schemas.openxmlformats.org/wordprocessingml/2006/main" xmlns:w14="http://schemas.microsoft.com/office/word/2010/wordml" xmlns:w15="http://schemas.microsoft.com/office/word/2012/wordml" xmlns:w16cex="http://schemas.microsoft.com/office/word/2018/wordml/cex" xmlns:w16cid="http://schemas.microsoft.com/office/word/2016/wordml/cid" xmlns:w16="http://schemas.microsoft.com/office/word/2018/wordml" xmlns:w16du="http://schemas.microsoft.com/office/word/2023/wordml/word16du" xmlns:w16sdtdh="http://schemas.microsoft.com/office/word/2020/wordml/sdtdatahash" xmlns:w16sdtfl="http://schemas.microsoft.com/office/word/2024/wordml/sdtformatlock" xmlns:w16se="http://schemas.microsoft.com/office/word/2015/wordml/symex" xmlns:wpg="http://schemas.microsoft.com/office/word/2010/wordprocessingGroup" xmlns:wpi="http://schemas.microsoft.com/office/word/2010/wordprocessingInk" xmlns:wne="http://schemas.microsoft.com/office/word/2006/wordml" xmlns:wps="http://schemas.microsoft.com/office/word/2010/wordprocessingShape" mc:Ignorable="w14 w15 w16se w16cid w16 w16cex w16sdtdh w16sdtfl w16du wp14">
+<w:document xmlns:wpc="http://schemas.microsoft.com/office/word/2010/wordprocessingCanvas" xmlns:cx="http://schemas.microsoft.com/office/drawing/2014/chartex" xmlns:cx1="http://schemas.microsoft.com/office/drawing/2015/9/8/chartex" xmlns:cx2="http://schemas.microsoft.com/office/drawing/2015/10/21/chartex" xmlns:cx3="http://schemas.microsoft.com/office/drawing/2016/5/9/chartex" xmlns:cx4="http://schemas.microsoft.com/office/drawing/2016/5/10/chartex" xmlns:cx5="http://schemas.microsoft.com/office/drawing/2016/5/11/chartex" xmlns:cx6="http://schemas.microsoft.com/office/drawing/2016/5/12/chartex" xmlns:cx7="http://schemas.microsoft.com/office/drawing/2016/5/13/chartex" xmlns:cx8="http://schemas.microsoft.com/office/drawing/2016/5/14/chartex" xmlns:mc="http://schemas.openxmlformats.org/markup-compatibility/2006" xmlns:m="http://schemas.openxmlformats.org/officeDocument/2006/math" xmlns:aink="http://schemas.microsoft.com/office/drawing/2016/ink" xmlns:am3d="http://schemas.microsoft.com/office/drawing/2017/model3d" xmlns:oel="http://schemas.microsoft.com/office/2019/extlst" xmlns:r="http://schemas.openxmlformats.org/officeDocument/2006/relationships" xmlns:wp14="http://schemas.microsoft.com/office/word/2010/wordprocessingDrawing" xmlns:wp="http://schemas.openxmlformats.org/drawingml/2006/wordprocessingDrawing" xmlns:wpg="http://schemas.microsoft.com/office/word/2010/wordprocessingGroup" xmlns:wpi="http://schemas.microsoft.com/office/word/2010/wordprocessingInk" xmlns:wps="http://schemas.microsoft.com/office/word/2010/wordprocessingShape" xmlns:o="urn:schemas-microsoft-com:office:office" xmlns:v="urn:schemas-microsoft-com:vml" xmlns:w10="urn:schemas-microsoft-com:office:word" xmlns:w="http://schemas.openxmlformats.org/wordprocessingml/2006/main" xmlns:w14="http://schemas.microsoft.com/office/word/2010/wordml" xmlns:w15="http://schemas.microsoft.com/office/word/2012/wordml" xmlns:w16cex="http://schemas.microsoft.com/office/word/2018/wordml/cex" xmlns:w16cid="http://schemas.microsoft.com/office/word/2016/wordml/cid" xmlns:w16="http://schemas.microsoft.com/office/word/2018/wordml" xmlns:w16sdtdh="http://schemas.microsoft.com/office/word/2020/wordml/sdtdatahash" xmlns:w16sdtfl="http://schemas.microsoft.com/office/word/2024/wordml/sdtformatlock" xmlns:w16se="http://schemas.microsoft.com/office/word/2015/wordml/symex" xmlns:w16du="http://schemas.microsoft.com/office/word/2023/wordml/word16du" xmlns:wne="http://schemas.microsoft.com/office/word/2006/wordml" mc:Ignorable="w14 w15 w16se w16cid w16 w16cex w16sdtdh w16sdtfl w16du wp14">
   <w:body>
     <w:p>
       <w:pPr>
@@ -118,21 +118,7 @@
         <w:rPr>
           <w:rFonts w:ascii="Times New Roman" w:hAnsi="Times New Roman" w:cs="Times New Roman"/>
         </w:rPr>
-        <w:t xml:space="preserve"> sort) mostrano chiaramente una pendenza nel grafico log-log, coerente con la complessità O(n²). Gli algoritmi </w:t>
-      </w:r>
-      <w:proofErr w:type="gramStart"/>
-      <w:r>
-        <w:rPr>
-          <w:rFonts w:ascii="Times New Roman" w:hAnsi="Times New Roman" w:cs="Times New Roman"/>
-        </w:rPr>
-        <w:t>O(</w:t>
-      </w:r>
-      <w:proofErr w:type="gramEnd"/>
-      <w:r>
-        <w:rPr>
-          <w:rFonts w:ascii="Times New Roman" w:hAnsi="Times New Roman" w:cs="Times New Roman"/>
-        </w:rPr>
-        <w:t xml:space="preserve">n log n) (merge, </w:t>
+        <w:t xml:space="preserve"> sort) mostrano chiaramente una pendenza nel grafico log-log, coerente con la complessità O(n²). Gli algoritmi O(n log n) (merge, </w:t>
       </w:r>
       <w:proofErr w:type="spellStart"/>
       <w:r>
@@ -149,7 +135,6 @@
         <w:t xml:space="preserve">, </w:t>
       </w:r>
       <w:proofErr w:type="spellStart"/>
-      <w:proofErr w:type="gramStart"/>
       <w:r>
         <w:rPr>
           <w:rFonts w:ascii="Times New Roman" w:hAnsi="Times New Roman" w:cs="Times New Roman"/>
@@ -161,14 +146,7 @@
         <w:rPr>
           <w:rFonts w:ascii="Times New Roman" w:hAnsi="Times New Roman" w:cs="Times New Roman"/>
         </w:rPr>
-        <w:t>::</w:t>
-      </w:r>
-      <w:proofErr w:type="gramEnd"/>
-      <w:r>
-        <w:rPr>
-          <w:rFonts w:ascii="Times New Roman" w:hAnsi="Times New Roman" w:cs="Times New Roman"/>
-        </w:rPr>
-        <w:t>sort) mostrano una pendenza visibilmente inferiore, che per n ≤ 100 appare quasi lineare per via del range ristretto.</w:t>
+        <w:t>::sort) mostrano una pendenza visibilmente inferiore, che per n ≤ 100 appare quasi lineare per via del range ristretto.</w:t>
       </w:r>
     </w:p>
     <w:p>
@@ -230,21 +208,7 @@
         <w:rPr>
           <w:rFonts w:ascii="Times New Roman" w:hAnsi="Times New Roman" w:cs="Times New Roman"/>
         </w:rPr>
-        <w:t xml:space="preserve">, in particolare è molto lento per n molto piccoli, in </w:t>
-      </w:r>
-      <w:proofErr w:type="gramStart"/>
-      <w:r>
-        <w:rPr>
-          <w:rFonts w:ascii="Times New Roman" w:hAnsi="Times New Roman" w:cs="Times New Roman"/>
-        </w:rPr>
-        <w:t>particolare  n</w:t>
-      </w:r>
-      <w:proofErr w:type="gramEnd"/>
-      <w:r>
-        <w:rPr>
-          <w:rFonts w:ascii="Times New Roman" w:hAnsi="Times New Roman" w:cs="Times New Roman"/>
-        </w:rPr>
-        <w:t xml:space="preserve"> &lt; 10 circa</w:t>
+        <w:t>, in particolare è molto lento per n molto piccoli, in particolare  n &lt; 10 circa</w:t>
       </w:r>
       <w:r>
         <w:rPr>
@@ -282,21 +246,7 @@
         <w:rPr>
           <w:rFonts w:ascii="Times New Roman" w:hAnsi="Times New Roman" w:cs="Times New Roman"/>
         </w:rPr>
-        <w:t xml:space="preserve"> frame, </w:t>
-      </w:r>
-      <w:proofErr w:type="spellStart"/>
-      <w:r>
-        <w:rPr>
-          <w:rFonts w:ascii="Times New Roman" w:hAnsi="Times New Roman" w:cs="Times New Roman"/>
-        </w:rPr>
-        <w:t>deallocamento</w:t>
-      </w:r>
-      <w:proofErr w:type="spellEnd"/>
-      <w:r>
-        <w:rPr>
-          <w:rFonts w:ascii="Times New Roman" w:hAnsi="Times New Roman" w:cs="Times New Roman"/>
-        </w:rPr>
-        <w:t xml:space="preserve"> finale) </w:t>
+        <w:t xml:space="preserve"> frame, deallocamento finale) </w:t>
       </w:r>
       <w:r>
         <w:rPr>
@@ -626,7 +576,6 @@
         <w:t xml:space="preserve">Confronto con </w:t>
       </w:r>
       <w:proofErr w:type="spellStart"/>
-      <w:proofErr w:type="gramStart"/>
       <w:r>
         <w:rPr>
           <w:rFonts w:ascii="Times New Roman" w:hAnsi="Times New Roman" w:cs="Times New Roman"/>
@@ -640,15 +589,7 @@
           <w:rFonts w:ascii="Times New Roman" w:hAnsi="Times New Roman" w:cs="Times New Roman"/>
           <w:u w:val="single"/>
         </w:rPr>
-        <w:t>::</w:t>
-      </w:r>
-      <w:proofErr w:type="gramEnd"/>
-      <w:r>
-        <w:rPr>
-          <w:rFonts w:ascii="Times New Roman" w:hAnsi="Times New Roman" w:cs="Times New Roman"/>
-          <w:u w:val="single"/>
-        </w:rPr>
-        <w:t>sort</w:t>
+        <w:t>::sort</w:t>
       </w:r>
     </w:p>
     <w:p>
@@ -665,7 +606,6 @@
         <w:t xml:space="preserve">La funzione </w:t>
       </w:r>
       <w:proofErr w:type="spellStart"/>
-      <w:proofErr w:type="gramStart"/>
       <w:r>
         <w:rPr>
           <w:rFonts w:ascii="Times New Roman" w:hAnsi="Times New Roman" w:cs="Times New Roman"/>
@@ -677,14 +617,7 @@
         <w:rPr>
           <w:rFonts w:ascii="Times New Roman" w:hAnsi="Times New Roman" w:cs="Times New Roman"/>
         </w:rPr>
-        <w:t>::</w:t>
-      </w:r>
-      <w:proofErr w:type="gramEnd"/>
-      <w:r>
-        <w:rPr>
-          <w:rFonts w:ascii="Times New Roman" w:hAnsi="Times New Roman" w:cs="Times New Roman"/>
-        </w:rPr>
-        <w:t xml:space="preserve">sort della libreria standard risulta </w:t>
+        <w:t xml:space="preserve">::sort della libreria standard risulta </w:t>
       </w:r>
       <w:r>
         <w:rPr>
@@ -719,7 +652,7 @@
 </file>
 
 <file path=word/styles.xml><?xml version="1.0" encoding="utf-8"?>
-<w:styles xmlns:mc="http://schemas.openxmlformats.org/markup-compatibility/2006" xmlns:r="http://schemas.openxmlformats.org/officeDocument/2006/relationships" xmlns:w="http://schemas.openxmlformats.org/wordprocessingml/2006/main" xmlns:w14="http://schemas.microsoft.com/office/word/2010/wordml" xmlns:w15="http://schemas.microsoft.com/office/word/2012/wordml" xmlns:w16cex="http://schemas.microsoft.com/office/word/2018/wordml/cex" xmlns:w16cid="http://schemas.microsoft.com/office/word/2016/wordml/cid" xmlns:w16="http://schemas.microsoft.com/office/word/2018/wordml" xmlns:w16du="http://schemas.microsoft.com/office/word/2023/wordml/word16du" xmlns:w16sdtdh="http://schemas.microsoft.com/office/word/2020/wordml/sdtdatahash" xmlns:w16sdtfl="http://schemas.microsoft.com/office/word/2024/wordml/sdtformatlock" xmlns:w16se="http://schemas.microsoft.com/office/word/2015/wordml/symex" mc:Ignorable="w14 w15 w16se w16cid w16 w16cex w16sdtdh w16sdtfl w16du">
+<w:styles xmlns:mc="http://schemas.openxmlformats.org/markup-compatibility/2006" xmlns:r="http://schemas.openxmlformats.org/officeDocument/2006/relationships" xmlns:w="http://schemas.openxmlformats.org/wordprocessingml/2006/main" xmlns:w14="http://schemas.microsoft.com/office/word/2010/wordml" xmlns:w15="http://schemas.microsoft.com/office/word/2012/wordml" xmlns:w16cex="http://schemas.microsoft.com/office/word/2018/wordml/cex" xmlns:w16cid="http://schemas.microsoft.com/office/word/2016/wordml/cid" xmlns:w16="http://schemas.microsoft.com/office/word/2018/wordml" xmlns:w16sdtdh="http://schemas.microsoft.com/office/word/2020/wordml/sdtdatahash" xmlns:w16sdtfl="http://schemas.microsoft.com/office/word/2024/wordml/sdtformatlock" xmlns:w16se="http://schemas.microsoft.com/office/word/2015/wordml/symex" xmlns:w16du="http://schemas.microsoft.com/office/word/2023/wordml/word16du" mc:Ignorable="w14 w15 w16se w16cid w16 w16cex w16sdtdh w16sdtfl w16du">
   <w:docDefaults>
     <w:rPrDefault>
       <w:rPr>

</xml_diff>